<commit_message>
Paper: authors, affiliation, correspondence, acknowledgments, AI-use disclosure, repository link
</commit_message>
<xml_diff>
--- a/manuscript/final/PINN_dielectric_interfaces_paper.docx
+++ b/manuscript/final/PINN_dielectric_interfaces_paper.docx
@@ -22,19 +22,19 @@
     <w:p>
       <w:pPr/>
       <w:r>
-        <w:t xml:space="preserve">[Author name]¹</w:t>
-      </w:r>
-    </w:p>
-    <w:p>
-      <w:pPr/>
-      <w:r>
-        <w:t xml:space="preserve">¹ [Department, Institution, City, Country]</w:t>
-      </w:r>
-    </w:p>
-    <w:p>
-      <w:pPr/>
-      <w:r>
-        <w:t xml:space="preserve">Corresponding author: [email address]</w:t>
+        <w:t xml:space="preserve">Devesh Patwari¹, Daksh Mehta¹, Tolga Uras Kurtay¹, Yasir Balat¹</w:t>
+      </w:r>
+    </w:p>
+    <w:p>
+      <w:pPr/>
+      <w:r>
+        <w:t xml:space="preserve">¹ Independent researchers</w:t>
+      </w:r>
+    </w:p>
+    <w:p>
+      <w:pPr/>
+      <w:r>
+        <w:t xml:space="preserve">Corresponding author: Devesh Patwari, devesh.patwari.1@gmail.com</w:t>
       </w:r>
     </w:p>
     <w:p>
@@ -3164,7 +3164,7 @@
     <w:p>
       <w:pPr/>
       <w:r>
-        <w:t xml:space="preserve">The project archive contains the source code, the raw databases (3,856 completed runs plus 60 technical-failure rows, superseded rows retained and labelled), processed outputs and figures, the frozen protocol and change log, and a single analysis pipeline (</w:t>
+        <w:t xml:space="preserve">The project repository, https://github.com/upcomingresearcher-cloud/PINNs-dielectric-, contains the source code, the raw databases (3,856 completed runs plus 60 technical-failure rows, superseded rows retained and labelled), processed outputs and figures, the frozen protocol and change log, and a single analysis pipeline (</w:t>
       </w:r>
       <w:r>
         <w:rPr>
@@ -3196,7 +3196,7 @@
     <w:p>
       <w:pPr/>
       <w:r>
-        <w:t xml:space="preserve">[To be completed by the author: funding sources, computing resources and people to thank.]</w:t>
+        <w:t xml:space="preserve">The authors thank John DeMason (University of Michigan, Ann Arbor) for his support. This work received no specific funding; all computations were run on a single CPU core.</w:t>
       </w:r>
     </w:p>
     <w:p>
@@ -3210,7 +3210,7 @@
     <w:p>
       <w:pPr/>
       <w:r>
-        <w:t xml:space="preserve">[To be completed by the author.]</w:t>
+        <w:t xml:space="preserve">Devesh Patwari, Daksh Mehta, Tolga Uras Kurtay and Yasir Balat conceived and directed the study, reviewed the results and approved the final manuscript. The AI system Claude (Anthropic) was used extensively under the authors' direction: it wrote the code, ran the experiments, performed the analyses and drafted the manuscript. The authors take full responsibility for the content of this article.</w:t>
       </w:r>
     </w:p>
     <w:p>
@@ -3224,7 +3224,7 @@
     <w:p>
       <w:pPr/>
       <w:r>
-        <w:t xml:space="preserve">The author declares no competing interests. [Confirm or amend.]</w:t>
+        <w:t xml:space="preserve">The authors declare no competing interests.</w:t>
       </w:r>
     </w:p>
     <w:p>
@@ -8578,7 +8578,7 @@
     <w:p>
       <w:pPr/>
       <w:r>
-        <w:t xml:space="preserve">The project archive contains the source code, raw run databases, processed tables, figures, the frozen protocol, the change log and a reproduction guide. Every completed run is one row of the database with its full configuration, all metrics, cost, software environment, hardware and git commit; per-run training trajectories (every 250 steps) and per-term gradient logs (every 25 steps) are stored separately.</w:t>
+        <w:t xml:space="preserve">The project repository (https://github.com/upcomingresearcher-cloud/PINNs-dielectric-) contains the source code, raw run databases, processed tables, figures, the frozen protocol, the change log and a reproduction guide. Every completed run is one row of the database with its full configuration, all metrics, cost, software environment, hardware and git commit; per-run training trajectories (every 250 steps) and per-term gradient logs (every 25 steps) are stored separately.</w:t>
       </w:r>
     </w:p>
     <w:p>

</xml_diff>